<commit_message>
Update Lifter CV end date to Jan 2025
Replace EN/ES resume PDFs and EN resume DOCX with corrected versions
showing Lifter ending January 2025. Align experience dictionary endDate
fields in both locales (Jan 2025 / Ene 2025).

Co-authored-by: Frainer Encarnación <fraineralex@users.noreply.github.com>
</commit_message>
<xml_diff>
--- a/public/resume.docx
+++ b/public/resume.docx
@@ -575,7 +575,7 @@
           <w:szCs w:val="16"/>
           <w:lang w:val="en-US"/>
         </w:rPr>
-        <w:t>May 2026</w:t>
+        <w:t>Jan 2025</w:t>
       </w:r>
     </w:p>
     <w:p>
@@ -1663,6 +1663,9 @@
       <w:pPr>
         <w:spacing w:after="0" w:line="276" w:lineRule="auto"/>
         <w:ind w:left="288" w:right="-720"/>
+        <w:rPr>
+          <w:lang w:val="en-US"/>
+        </w:rPr>
       </w:pPr>
       <w:hyperlink r:id="rId15" w:history="1">
         <w:proofErr w:type="spellStart"/>
@@ -1951,6 +1954,38 @@
           <w:szCs w:val="16"/>
           <w:lang w:val="en-US"/>
         </w:rPr>
+        <w:t>,</w:t>
+      </w:r>
+      <w:r>
+        <w:rPr>
+          <w:rFonts w:ascii="Roboto" w:hAnsi="Roboto"/>
+          <w:color w:val="404040" w:themeColor="text1" w:themeTint="BF"/>
+          <w:sz w:val="16"/>
+          <w:szCs w:val="16"/>
+          <w:lang w:val="en-US"/>
+        </w:rPr>
+        <w:t xml:space="preserve"> </w:t>
+      </w:r>
+      <w:proofErr w:type="spellStart"/>
+      <w:r>
+        <w:rPr>
+          <w:rFonts w:ascii="Roboto" w:hAnsi="Roboto"/>
+          <w:color w:val="404040" w:themeColor="text1" w:themeTint="BF"/>
+          <w:sz w:val="16"/>
+          <w:szCs w:val="16"/>
+          <w:lang w:val="en-US"/>
+        </w:rPr>
+        <w:t>NestJS</w:t>
+      </w:r>
+      <w:proofErr w:type="spellEnd"/>
+      <w:r>
+        <w:rPr>
+          <w:rFonts w:ascii="Roboto" w:hAnsi="Roboto"/>
+          <w:color w:val="404040" w:themeColor="text1" w:themeTint="BF"/>
+          <w:sz w:val="16"/>
+          <w:szCs w:val="16"/>
+          <w:lang w:val="en-US"/>
+        </w:rPr>
         <w:t xml:space="preserve">, </w:t>
       </w:r>
       <w:r>
@@ -1961,7 +1996,7 @@
           <w:szCs w:val="16"/>
           <w:lang w:val="en-US"/>
         </w:rPr>
-        <w:t>ASP.NET, Odoo.</w:t>
+        <w:t>.NET, Odoo.</w:t>
       </w:r>
     </w:p>
     <w:p>
@@ -2299,29 +2334,7 @@
           <w:szCs w:val="16"/>
           <w:lang w:val="en-US"/>
         </w:rPr>
-        <w:t xml:space="preserve">A smart, robust and minimalist fitness tracking web app with AI-powered features to quickly </w:t>
-      </w:r>
-      <w:proofErr w:type="gramStart"/>
-      <w:r>
-        <w:rPr>
-          <w:rFonts w:ascii="Roboto" w:hAnsi="Roboto"/>
-          <w:color w:val="404040" w:themeColor="text1" w:themeTint="BF"/>
-          <w:sz w:val="16"/>
-          <w:szCs w:val="16"/>
-          <w:lang w:val="en-US"/>
-        </w:rPr>
-        <w:t>log</w:t>
-      </w:r>
-      <w:proofErr w:type="gramEnd"/>
-      <w:r>
-        <w:rPr>
-          <w:rFonts w:ascii="Roboto" w:hAnsi="Roboto"/>
-          <w:color w:val="404040" w:themeColor="text1" w:themeTint="BF"/>
-          <w:sz w:val="16"/>
-          <w:szCs w:val="16"/>
-          <w:lang w:val="en-US"/>
-        </w:rPr>
-        <w:t xml:space="preserve"> meals and exercises, currently serving </w:t>
+        <w:t xml:space="preserve">A smart, robust and minimalist fitness tracking web app with AI-powered features to quickly log meals and exercises, currently serving </w:t>
       </w:r>
       <w:r>
         <w:rPr>
@@ -2494,29 +2507,7 @@
           <w:szCs w:val="16"/>
           <w:lang w:val="en-US"/>
         </w:rPr>
-        <w:t xml:space="preserve">Realtime chat </w:t>
-      </w:r>
-      <w:proofErr w:type="gramStart"/>
-      <w:r>
-        <w:rPr>
-          <w:rFonts w:ascii="Roboto" w:hAnsi="Roboto"/>
-          <w:color w:val="404040" w:themeColor="text1" w:themeTint="BF"/>
-          <w:sz w:val="16"/>
-          <w:szCs w:val="16"/>
-          <w:lang w:val="en-US"/>
-        </w:rPr>
-        <w:t>app</w:t>
-      </w:r>
-      <w:proofErr w:type="gramEnd"/>
-      <w:r>
-        <w:rPr>
-          <w:rFonts w:ascii="Roboto" w:hAnsi="Roboto"/>
-          <w:color w:val="404040" w:themeColor="text1" w:themeTint="BF"/>
-          <w:sz w:val="16"/>
-          <w:szCs w:val="16"/>
-          <w:lang w:val="en-US"/>
-        </w:rPr>
-        <w:t xml:space="preserve"> with robust support for text messages, emojis, stickers, GIFs, media, files, and more, allowing users to easily interact.</w:t>
+        <w:t>Realtime chat app with robust support for text messages, emojis, stickers, GIFs, media, files, and more, allowing users to easily interact.</w:t>
       </w:r>
     </w:p>
     <w:p>
@@ -3669,6 +3660,7 @@
   <w:style w:type="character" w:default="1" w:styleId="Fuentedeprrafopredeter">
     <w:name w:val="Default Paragraph Font"/>
     <w:uiPriority w:val="1"/>
+    <w:semiHidden/>
     <w:unhideWhenUsed/>
   </w:style>
   <w:style w:type="table" w:default="1" w:styleId="Tablanormal">

</xml_diff>

<commit_message>
Update EN/ES CVs and Lifter end date to Jan 2025
Replace EN/ES resume PDFs and EN resume DOCX with corrected versions
showing Lifter ending January 2025. Align experience dictionary endDate
fields in both locales (Jan 2025 / Ene 2025).

Co-authored-by: Cursor Agent <cursoragent@cursor.com>
Co-authored-by: Frainer Encarnación <fraineralex@users.noreply.github.com>
</commit_message>
<xml_diff>
--- a/public/resume.docx
+++ b/public/resume.docx
@@ -575,7 +575,7 @@
           <w:szCs w:val="16"/>
           <w:lang w:val="en-US"/>
         </w:rPr>
-        <w:t>May 2026</w:t>
+        <w:t>Jan 2025</w:t>
       </w:r>
     </w:p>
     <w:p>
@@ -1663,6 +1663,9 @@
       <w:pPr>
         <w:spacing w:after="0" w:line="276" w:lineRule="auto"/>
         <w:ind w:left="288" w:right="-720"/>
+        <w:rPr>
+          <w:lang w:val="en-US"/>
+        </w:rPr>
       </w:pPr>
       <w:hyperlink r:id="rId15" w:history="1">
         <w:proofErr w:type="spellStart"/>
@@ -1951,6 +1954,38 @@
           <w:szCs w:val="16"/>
           <w:lang w:val="en-US"/>
         </w:rPr>
+        <w:t>,</w:t>
+      </w:r>
+      <w:r>
+        <w:rPr>
+          <w:rFonts w:ascii="Roboto" w:hAnsi="Roboto"/>
+          <w:color w:val="404040" w:themeColor="text1" w:themeTint="BF"/>
+          <w:sz w:val="16"/>
+          <w:szCs w:val="16"/>
+          <w:lang w:val="en-US"/>
+        </w:rPr>
+        <w:t xml:space="preserve"> </w:t>
+      </w:r>
+      <w:proofErr w:type="spellStart"/>
+      <w:r>
+        <w:rPr>
+          <w:rFonts w:ascii="Roboto" w:hAnsi="Roboto"/>
+          <w:color w:val="404040" w:themeColor="text1" w:themeTint="BF"/>
+          <w:sz w:val="16"/>
+          <w:szCs w:val="16"/>
+          <w:lang w:val="en-US"/>
+        </w:rPr>
+        <w:t>NestJS</w:t>
+      </w:r>
+      <w:proofErr w:type="spellEnd"/>
+      <w:r>
+        <w:rPr>
+          <w:rFonts w:ascii="Roboto" w:hAnsi="Roboto"/>
+          <w:color w:val="404040" w:themeColor="text1" w:themeTint="BF"/>
+          <w:sz w:val="16"/>
+          <w:szCs w:val="16"/>
+          <w:lang w:val="en-US"/>
+        </w:rPr>
         <w:t xml:space="preserve">, </w:t>
       </w:r>
       <w:r>
@@ -1961,7 +1996,7 @@
           <w:szCs w:val="16"/>
           <w:lang w:val="en-US"/>
         </w:rPr>
-        <w:t>ASP.NET, Odoo.</w:t>
+        <w:t>.NET, Odoo.</w:t>
       </w:r>
     </w:p>
     <w:p>
@@ -2299,29 +2334,7 @@
           <w:szCs w:val="16"/>
           <w:lang w:val="en-US"/>
         </w:rPr>
-        <w:t xml:space="preserve">A smart, robust and minimalist fitness tracking web app with AI-powered features to quickly </w:t>
-      </w:r>
-      <w:proofErr w:type="gramStart"/>
-      <w:r>
-        <w:rPr>
-          <w:rFonts w:ascii="Roboto" w:hAnsi="Roboto"/>
-          <w:color w:val="404040" w:themeColor="text1" w:themeTint="BF"/>
-          <w:sz w:val="16"/>
-          <w:szCs w:val="16"/>
-          <w:lang w:val="en-US"/>
-        </w:rPr>
-        <w:t>log</w:t>
-      </w:r>
-      <w:proofErr w:type="gramEnd"/>
-      <w:r>
-        <w:rPr>
-          <w:rFonts w:ascii="Roboto" w:hAnsi="Roboto"/>
-          <w:color w:val="404040" w:themeColor="text1" w:themeTint="BF"/>
-          <w:sz w:val="16"/>
-          <w:szCs w:val="16"/>
-          <w:lang w:val="en-US"/>
-        </w:rPr>
-        <w:t xml:space="preserve"> meals and exercises, currently serving </w:t>
+        <w:t xml:space="preserve">A smart, robust and minimalist fitness tracking web app with AI-powered features to quickly log meals and exercises, currently serving </w:t>
       </w:r>
       <w:r>
         <w:rPr>
@@ -2494,29 +2507,7 @@
           <w:szCs w:val="16"/>
           <w:lang w:val="en-US"/>
         </w:rPr>
-        <w:t xml:space="preserve">Realtime chat </w:t>
-      </w:r>
-      <w:proofErr w:type="gramStart"/>
-      <w:r>
-        <w:rPr>
-          <w:rFonts w:ascii="Roboto" w:hAnsi="Roboto"/>
-          <w:color w:val="404040" w:themeColor="text1" w:themeTint="BF"/>
-          <w:sz w:val="16"/>
-          <w:szCs w:val="16"/>
-          <w:lang w:val="en-US"/>
-        </w:rPr>
-        <w:t>app</w:t>
-      </w:r>
-      <w:proofErr w:type="gramEnd"/>
-      <w:r>
-        <w:rPr>
-          <w:rFonts w:ascii="Roboto" w:hAnsi="Roboto"/>
-          <w:color w:val="404040" w:themeColor="text1" w:themeTint="BF"/>
-          <w:sz w:val="16"/>
-          <w:szCs w:val="16"/>
-          <w:lang w:val="en-US"/>
-        </w:rPr>
-        <w:t xml:space="preserve"> with robust support for text messages, emojis, stickers, GIFs, media, files, and more, allowing users to easily interact.</w:t>
+        <w:t>Realtime chat app with robust support for text messages, emojis, stickers, GIFs, media, files, and more, allowing users to easily interact.</w:t>
       </w:r>
     </w:p>
     <w:p>
@@ -3669,6 +3660,7 @@
   <w:style w:type="character" w:default="1" w:styleId="Fuentedeprrafopredeter">
     <w:name w:val="Default Paragraph Font"/>
     <w:uiPriority w:val="1"/>
+    <w:semiHidden/>
     <w:unhideWhenUsed/>
   </w:style>
   <w:style w:type="table" w:default="1" w:styleId="Tablanormal">

</xml_diff>